<commit_message>
Fix table rendering: handle escaped pipes in markdown parser and use consistent column widths in docx builder
</commit_message>
<xml_diff>
--- a/Outputs/test.docx
+++ b/Outputs/test.docx
@@ -574,17 +574,13 @@
         </w:tblBorders>
       </w:tblPr>
       <w:tblGrid>
-        <w:gridCol w:w="100"/>
-        <w:gridCol w:w="100"/>
-        <w:gridCol w:w="100"/>
-        <w:gridCol w:w="100"/>
-        <w:gridCol w:w="100"/>
-        <w:gridCol w:w="100"/>
+        <w:gridCol w:w="3120"/>
+        <w:gridCol w:w="3120"/>
+        <w:gridCol w:w="3120"/>
       </w:tblGrid>
       <w:tr>
         <w:tc>
           <w:tcPr>
-            <w:tcW w:type="dxa" w:w="1560"/>
             <w:shd w:fill="F8F9FA" w:val="clear"/>
           </w:tcPr>
           <w:p>
@@ -598,7 +594,6 @@
         </w:tc>
         <w:tc>
           <w:tcPr>
-            <w:tcW w:type="dxa" w:w="1560"/>
             <w:shd w:fill="F8F9FA" w:val="clear"/>
           </w:tcPr>
           <w:p>
@@ -612,7 +607,6 @@
         </w:tc>
         <w:tc>
           <w:tcPr>
-            <w:tcW w:type="dxa" w:w="1560"/>
             <w:shd w:fill="F8F9FA" w:val="clear"/>
           </w:tcPr>
           <w:p>
@@ -627,9 +621,6 @@
       </w:tr>
       <w:tr>
         <w:tc>
-          <w:tcPr>
-            <w:tcW w:type="dxa" w:w="1560"/>
-          </w:tcPr>
           <w:p>
             <w:pPr>
               <w:spacing w:after="40" w:before="40"/>
@@ -644,9 +635,6 @@
           </w:p>
         </w:tc>
         <w:tc>
-          <w:tcPr>
-            <w:tcW w:type="dxa" w:w="1560"/>
-          </w:tcPr>
           <w:p>
             <w:pPr>
               <w:spacing w:after="40" w:before="40"/>
@@ -667,9 +655,6 @@
           </w:p>
         </w:tc>
         <w:tc>
-          <w:tcPr>
-            <w:tcW w:type="dxa" w:w="1560"/>
-          </w:tcPr>
           <w:p>
             <w:pPr>
               <w:spacing w:after="40" w:before="40"/>
@@ -682,9 +667,6 @@
       </w:tr>
       <w:tr>
         <w:tc>
-          <w:tcPr>
-            <w:tcW w:type="dxa" w:w="1560"/>
-          </w:tcPr>
           <w:p>
             <w:pPr>
               <w:spacing w:after="40" w:before="40"/>
@@ -699,9 +681,6 @@
           </w:p>
         </w:tc>
         <w:tc>
-          <w:tcPr>
-            <w:tcW w:type="dxa" w:w="1560"/>
-          </w:tcPr>
           <w:p>
             <w:pPr>
               <w:spacing w:after="40" w:before="40"/>
@@ -712,9 +691,6 @@
           </w:p>
         </w:tc>
         <w:tc>
-          <w:tcPr>
-            <w:tcW w:type="dxa" w:w="1560"/>
-          </w:tcPr>
           <w:p>
             <w:pPr>
               <w:spacing w:after="40" w:before="40"/>
@@ -727,9 +703,6 @@
       </w:tr>
       <w:tr>
         <w:tc>
-          <w:tcPr>
-            <w:tcW w:type="dxa" w:w="1560"/>
-          </w:tcPr>
           <w:p>
             <w:pPr>
               <w:spacing w:after="40" w:before="40"/>
@@ -760,9 +733,6 @@
           </w:p>
         </w:tc>
         <w:tc>
-          <w:tcPr>
-            <w:tcW w:type="dxa" w:w="1560"/>
-          </w:tcPr>
           <w:p>
             <w:pPr>
               <w:spacing w:after="40" w:before="40"/>
@@ -773,9 +743,6 @@
           </w:p>
         </w:tc>
         <w:tc>
-          <w:tcPr>
-            <w:tcW w:type="dxa" w:w="1560"/>
-          </w:tcPr>
           <w:p>
             <w:pPr>
               <w:spacing w:after="40" w:before="40"/>
@@ -788,9 +755,6 @@
       </w:tr>
       <w:tr>
         <w:tc>
-          <w:tcPr>
-            <w:tcW w:type="dxa" w:w="1560"/>
-          </w:tcPr>
           <w:p>
             <w:pPr>
               <w:spacing w:after="40" w:before="40"/>
@@ -801,9 +765,6 @@
           </w:p>
         </w:tc>
         <w:tc>
-          <w:tcPr>
-            <w:tcW w:type="dxa" w:w="1560"/>
-          </w:tcPr>
           <w:p>
             <w:pPr>
               <w:spacing w:after="40" w:before="40"/>
@@ -834,9 +795,6 @@
           </w:p>
         </w:tc>
         <w:tc>
-          <w:tcPr>
-            <w:tcW w:type="dxa" w:w="1560"/>
-          </w:tcPr>
           <w:p>
             <w:pPr>
               <w:spacing w:after="40" w:before="40"/>
@@ -859,61 +817,20 @@
       </w:tr>
       <w:tr>
         <w:tc>
-          <w:tcPr>
-            <w:tcW w:type="dxa" w:w="1560"/>
-          </w:tcPr>
-          <w:p>
-            <w:pPr>
-              <w:spacing w:after="40" w:before="40"/>
-            </w:pPr>
-            <w:r>
-              <w:t xml:space="preserve">`\</w:t>
-            </w:r>
-          </w:p>
-        </w:tc>
-        <w:tc>
-          <w:tcPr>
-            <w:tcW w:type="dxa" w:w="1560"/>
-          </w:tcPr>
-          <w:p>
-            <w:pPr>
-              <w:spacing w:after="40" w:before="40"/>
-            </w:pPr>
-            <w:r>
-              <w:t xml:space="preserve">Table \</w:t>
-            </w:r>
-          </w:p>
-        </w:tc>
-        <w:tc>
-          <w:tcPr>
-            <w:tcW w:type="dxa" w:w="1560"/>
-          </w:tcPr>
-          <w:p>
-            <w:pPr>
-              <w:spacing w:after="40" w:before="40"/>
-            </w:pPr>
-            <w:r>
-              <w:t xml:space="preserve">... \</w:t>
-            </w:r>
-          </w:p>
-        </w:tc>
-        <w:tc>
-          <w:tcPr>
-            <w:tcW w:type="dxa" w:w="1560"/>
-          </w:tcPr>
-          <w:p>
-            <w:pPr>
-              <w:spacing w:after="40" w:before="40"/>
-            </w:pPr>
-            <w:r>
-              <w:t xml:space="preserve">`</w:t>
-            </w:r>
-          </w:p>
-        </w:tc>
-        <w:tc>
-          <w:tcPr>
-            <w:tcW w:type="dxa" w:w="1560"/>
-          </w:tcPr>
+          <w:p>
+            <w:pPr>
+              <w:spacing w:after="40" w:before="40"/>
+            </w:pPr>
+            <w:r>
+              <w:rPr>
+                <w:rFonts w:ascii="Consolas" w:cs="Consolas" w:eastAsia="Consolas" w:hAnsi="Consolas"/>
+                <w:shd w:fill="F1F3F4" w:val="clear"/>
+              </w:rPr>
+              <w:t xml:space="preserve">| Table | ... |</w:t>
+            </w:r>
+          </w:p>
+        </w:tc>
+        <w:tc>
           <w:p>
             <w:pPr>
               <w:spacing w:after="40" w:before="40"/>
@@ -924,9 +841,6 @@
           </w:p>
         </w:tc>
         <w:tc>
-          <w:tcPr>
-            <w:tcW w:type="dxa" w:w="1560"/>
-          </w:tcPr>
           <w:p>
             <w:pPr>
               <w:spacing w:after="40" w:before="40"/>
@@ -939,9 +853,6 @@
       </w:tr>
       <w:tr>
         <w:tc>
-          <w:tcPr>
-            <w:tcW w:type="dxa" w:w="1560"/>
-          </w:tcPr>
           <w:p>
             <w:pPr>
               <w:spacing w:after="40" w:before="40"/>
@@ -956,9 +867,6 @@
           </w:p>
         </w:tc>
         <w:tc>
-          <w:tcPr>
-            <w:tcW w:type="dxa" w:w="1560"/>
-          </w:tcPr>
           <w:p>
             <w:pPr>
               <w:spacing w:after="40" w:before="40"/>
@@ -969,9 +877,6 @@
           </w:p>
         </w:tc>
         <w:tc>
-          <w:tcPr>
-            <w:tcW w:type="dxa" w:w="1560"/>
-          </w:tcPr>
           <w:p>
             <w:pPr>
               <w:spacing w:after="40" w:before="40"/>
@@ -984,9 +889,6 @@
       </w:tr>
       <w:tr>
         <w:tc>
-          <w:tcPr>
-            <w:tcW w:type="dxa" w:w="1560"/>
-          </w:tcPr>
           <w:p>
             <w:pPr>
               <w:spacing w:after="40" w:before="40"/>
@@ -997,9 +899,6 @@
           </w:p>
         </w:tc>
         <w:tc>
-          <w:tcPr>
-            <w:tcW w:type="dxa" w:w="1560"/>
-          </w:tcPr>
           <w:p>
             <w:pPr>
               <w:spacing w:after="40" w:before="40"/>
@@ -1010,9 +909,6 @@
           </w:p>
         </w:tc>
         <w:tc>
-          <w:tcPr>
-            <w:tcW w:type="dxa" w:w="1560"/>
-          </w:tcPr>
           <w:p>
             <w:pPr>
               <w:spacing w:after="40" w:before="40"/>

</xml_diff>

<commit_message>
Fix table borders: change border size from 1 to 4 (0.5pt) so lines are visible
</commit_message>
<xml_diff>
--- a/Outputs/test.docx
+++ b/Outputs/test.docx
@@ -17,7 +17,7 @@
         <w:ind w:left="720" w:right="720"/>
       </w:pPr>
       <w:r>
-        <w:t xml:space="preserve">Paste from Claude, ChatGPT, or Gemini into Google Docs — perfectly formatted, zero clicks.</w:t>
+        <w:t xml:space="preserve">Paste from Claude, ChatGPT, or Gemini — download a clean .docx file, perfectly formatted.</w:t>
       </w:r>
     </w:p>
     <w:p>
@@ -32,7 +32,27 @@
         <w:t xml:space="preserve">paste-to-docs</w:t>
       </w:r>
       <w:r>
-        <w:t xml:space="preserve"> is a Chrome extension that intercepts your paste event, detects AI-generated content, strips broken HTML, and rebuilds clean semantic structure that Google Docs actually understands.</w:t>
+        <w:t xml:space="preserve"> converts AI-formatted responses into a clean </w:t>
+      </w:r>
+      <w:r>
+        <w:rPr>
+          <w:rFonts w:ascii="Consolas" w:cs="Consolas" w:eastAsia="Consolas" w:hAnsi="Consolas"/>
+          <w:shd w:fill="F1F3F4" w:val="clear"/>
+        </w:rPr>
+        <w:t xml:space="preserve">.docx</w:t>
+      </w:r>
+      <w:r>
+        <w:t xml:space="preserve"> file you can open in any document editor. Use the web app at </w:t>
+      </w:r>
+      <w:r>
+        <w:rPr>
+          <w:color w:val="1A73E8"/>
+          <w:u w:val="single"/>
+        </w:rPr>
+        <w:t xml:space="preserve">paste-to-docs</w:t>
+      </w:r>
+      <w:r>
+        <w:t xml:space="preserve"> or the companion Chrome extension.</w:t>
       </w:r>
     </w:p>
     <w:p>
@@ -40,7 +60,7 @@
         <w:spacing w:after="120"/>
       </w:pPr>
       <w:r>
-        <w:t xml:space="preserve">No reformatting. No extra paste. No copy-to-markdown-converter. Just Ctrl+V.</w:t>
+        <w:t xml:space="preserve">No reformatting. No manual cleanup. Just paste and download.</w:t>
       </w:r>
     </w:p>
     <w:p>
@@ -324,7 +344,7 @@
           <w:sz w:val="20"/>
           <w:szCs w:val="20"/>
         </w:rPr>
-        <w:t xml:space="preserve">   Chrome intercepts paste event (capture phase)</w:t>
+        <w:t xml:space="preserve">   Opens paste-to-docs web app</w:t>
       </w:r>
     </w:p>
     <w:p>
@@ -369,22 +389,22 @@
           <w:sz w:val="20"/>
           <w:szCs w:val="20"/>
         </w:rPr>
-        <w:t xml:space="preserve">   detectSource()  ──── checks HTML signatures for Claude, ChatGPT, Gemini</w:t>
-      </w:r>
-    </w:p>
-    <w:p>
-      <w:pPr>
-        <w:shd w:fill="F1F3F4" w:val="clear"/>
-        <w:spacing w:after="0" w:before="0" w:line="240"/>
-        <w:ind w:left="430"/>
-      </w:pPr>
-      <w:r>
-        <w:rPr>
-          <w:rFonts w:ascii="Consolas" w:cs="Consolas" w:eastAsia="Consolas" w:hAnsi="Consolas"/>
-          <w:sz w:val="20"/>
-          <w:szCs w:val="20"/>
-        </w:rPr>
-        <w:t xml:space="preserve">        │                then falls back to markdown pattern detection</w:t>
+        <w:t xml:space="preserve">   Pastes into the editor</w:t>
+      </w:r>
+    </w:p>
+    <w:p>
+      <w:pPr>
+        <w:shd w:fill="F1F3F4" w:val="clear"/>
+        <w:spacing w:after="0" w:before="0" w:line="240"/>
+        <w:ind w:left="430"/>
+      </w:pPr>
+      <w:r>
+        <w:rPr>
+          <w:rFonts w:ascii="Consolas" w:cs="Consolas" w:eastAsia="Consolas" w:hAnsi="Consolas"/>
+          <w:sz w:val="20"/>
+          <w:szCs w:val="20"/>
+        </w:rPr>
+        <w:t xml:space="preserve">        │</w:t>
       </w:r>
     </w:p>
     <w:p>
@@ -414,22 +434,22 @@
           <w:sz w:val="20"/>
           <w:szCs w:val="20"/>
         </w:rPr>
-        <w:t xml:space="preserve">   htmlToClean()   ──── walks DOM tree, strips AI-specific classes/wrappers,</w:t>
-      </w:r>
-    </w:p>
-    <w:p>
-      <w:pPr>
-        <w:shd w:fill="F1F3F4" w:val="clear"/>
-        <w:spacing w:after="0" w:before="0" w:line="240"/>
-        <w:ind w:left="430"/>
-      </w:pPr>
-      <w:r>
-        <w:rPr>
-          <w:rFonts w:ascii="Consolas" w:cs="Consolas" w:eastAsia="Consolas" w:hAnsi="Consolas"/>
-          <w:sz w:val="20"/>
-          <w:szCs w:val="20"/>
-        </w:rPr>
-        <w:t xml:space="preserve">        │                rebuilds clean semantic HTML</w:t>
+        <w:t xml:space="preserve">   markdownToHtml() ──── parses markdown into clean HTML</w:t>
+      </w:r>
+    </w:p>
+    <w:p>
+      <w:pPr>
+        <w:shd w:fill="F1F3F4" w:val="clear"/>
+        <w:spacing w:after="0" w:before="0" w:line="240"/>
+        <w:ind w:left="430"/>
+      </w:pPr>
+      <w:r>
+        <w:rPr>
+          <w:rFonts w:ascii="Consolas" w:cs="Consolas" w:eastAsia="Consolas" w:hAnsi="Consolas"/>
+          <w:sz w:val="20"/>
+          <w:szCs w:val="20"/>
+        </w:rPr>
+        <w:t xml:space="preserve">        │</w:t>
       </w:r>
     </w:p>
     <w:p>
@@ -459,7 +479,7 @@
           <w:sz w:val="20"/>
           <w:szCs w:val="20"/>
         </w:rPr>
-        <w:t xml:space="preserve">   [fallback]      ──── markdownToHtml() for plain-text clipboard content</w:t>
+        <w:t xml:space="preserve">   buildDocx()     ──── maps HTML elements to docx primitives</w:t>
       </w:r>
     </w:p>
     <w:p>
@@ -495,51 +515,6 @@
     <w:p>
       <w:pPr>
         <w:shd w:fill="F1F3F4" w:val="clear"/>
-        <w:spacing w:after="0" w:before="0" w:line="240"/>
-        <w:ind w:left="430"/>
-      </w:pPr>
-      <w:r>
-        <w:rPr>
-          <w:rFonts w:ascii="Consolas" w:cs="Consolas" w:eastAsia="Consolas" w:hAnsi="Consolas"/>
-          <w:sz w:val="20"/>
-          <w:szCs w:val="20"/>
-        </w:rPr>
-        <w:t xml:space="preserve">   Clean HTML written to clipboard → native paste triggered</w:t>
-      </w:r>
-    </w:p>
-    <w:p>
-      <w:pPr>
-        <w:shd w:fill="F1F3F4" w:val="clear"/>
-        <w:spacing w:after="0" w:before="0" w:line="240"/>
-        <w:ind w:left="430"/>
-      </w:pPr>
-      <w:r>
-        <w:rPr>
-          <w:rFonts w:ascii="Consolas" w:cs="Consolas" w:eastAsia="Consolas" w:hAnsi="Consolas"/>
-          <w:sz w:val="20"/>
-          <w:szCs w:val="20"/>
-        </w:rPr>
-        <w:t xml:space="preserve">        │</w:t>
-      </w:r>
-    </w:p>
-    <w:p>
-      <w:pPr>
-        <w:shd w:fill="F1F3F4" w:val="clear"/>
-        <w:spacing w:after="0" w:before="0" w:line="240"/>
-        <w:ind w:left="430"/>
-      </w:pPr>
-      <w:r>
-        <w:rPr>
-          <w:rFonts w:ascii="Consolas" w:cs="Consolas" w:eastAsia="Consolas" w:hAnsi="Consolas"/>
-          <w:sz w:val="20"/>
-          <w:szCs w:val="20"/>
-        </w:rPr>
-        <w:t xml:space="preserve">        ▼</w:t>
-      </w:r>
-    </w:p>
-    <w:p>
-      <w:pPr>
-        <w:shd w:fill="F1F3F4" w:val="clear"/>
         <w:spacing w:after="120" w:before="0" w:line="240"/>
         <w:ind w:left="430"/>
       </w:pPr>
@@ -549,7 +524,7 @@
           <w:sz w:val="20"/>
           <w:szCs w:val="20"/>
         </w:rPr>
-        <w:t xml:space="preserve">   Google Docs receives properly structured content ✓</w:t>
+        <w:t xml:space="preserve">   Downloads a .docx file ✓</w:t>
       </w:r>
     </w:p>
     <w:p>
@@ -565,12 +540,12 @@
       <w:tblPr>
         <w:tblW w:type="pct" w:w="100%"/>
         <w:tblBorders>
-          <w:top w:val="single" w:color="999999" w:sz="1"/>
-          <w:left w:val="single" w:color="999999" w:sz="1"/>
-          <w:bottom w:val="single" w:color="999999" w:sz="1"/>
-          <w:right w:val="single" w:color="999999" w:sz="1"/>
-          <w:insideH w:val="single" w:color="999999" w:sz="1"/>
-          <w:insideV w:val="single" w:color="999999" w:sz="1"/>
+          <w:top w:val="single" w:color="999999" w:sz="4"/>
+          <w:left w:val="single" w:color="999999" w:sz="4"/>
+          <w:bottom w:val="single" w:color="999999" w:sz="4"/>
+          <w:right w:val="single" w:color="999999" w:sz="4"/>
+          <w:insideH w:val="single" w:color="999999" w:sz="4"/>
+          <w:insideV w:val="single" w:color="999999" w:sz="4"/>
         </w:tblBorders>
       </w:tblPr>
       <w:tblGrid>

</xml_diff>